<commit_message>
Updated report to reference SMOTE
</commit_message>
<xml_diff>
--- a/Phase 5/Phase 5.docx
+++ b/Phase 5/Phase 5.docx
@@ -26,10 +26,10 @@
           <w:rStyle w:val="FirstName"/>
         </w:rPr>
         <w:sectPr>
-          <w:headerReference w:type="even" r:id="rId4"/>
-          <w:headerReference w:type="default" r:id="rId5"/>
-          <w:footerReference w:type="even" r:id="rId6"/>
-          <w:footerReference w:type="default" r:id="rId7"/>
+          <w:headerReference w:type="even" r:id="rId6"/>
+          <w:headerReference w:type="default" r:id="rId7"/>
+          <w:footerReference w:type="even" r:id="rId8"/>
+          <w:footerReference w:type="default" r:id="rId9"/>
           <w:endnotePr>
             <w:numFmt w:val="decimal"/>
           </w:endnotePr>
@@ -389,7 +389,7 @@
                     </pic:cNvPicPr>
                   </pic:nvPicPr>
                   <pic:blipFill>
-                    <a:blip r:embed="rId8" cstate="print">
+                    <a:blip r:embed="rId10" cstate="print">
                       <a:extLst>
                         <a:ext uri="{28A0092B-C50C-407E-A947-70E740481C1C}">
                           <a14:useLocalDpi xmlns:a14="http://schemas.microsoft.com/office/drawing/2010/main" val="0"/>
@@ -569,7 +569,23 @@
           <w:szCs w:val="28"/>
           <w14:ligatures w14:val="standard"/>
         </w:rPr>
-        <w:t>to work like it does in keras where some nodes are dropped to avoid overfiting.</w:t>
+        <w:t xml:space="preserve">to work like it does in keras where some nodes are dropped to avoid </w:t>
+      </w:r>
+      <w:r>
+        <w:rPr>
+          <w:sz w:val="20"/>
+          <w:szCs w:val="28"/>
+          <w14:ligatures w14:val="standard"/>
+        </w:rPr>
+        <w:t>overfitting</w:t>
+      </w:r>
+      <w:r>
+        <w:rPr>
+          <w:sz w:val="20"/>
+          <w:szCs w:val="28"/>
+          <w14:ligatures w14:val="standard"/>
+        </w:rPr>
+        <w:t>.</w:t>
       </w:r>
     </w:p>
     <w:p>
@@ -639,7 +655,23 @@
           <w:szCs w:val="28"/>
           <w14:ligatures w14:val="standard"/>
         </w:rPr>
-        <w:t xml:space="preserve"> The feed forward and backpropagation are repeated for as many epochs as defined.</w:t>
+        <w:t xml:space="preserve"> The feed forward and backpropagation are repeated for</w:t>
+      </w:r>
+      <w:r>
+        <w:rPr>
+          <w:sz w:val="20"/>
+          <w:szCs w:val="28"/>
+          <w14:ligatures w14:val="standard"/>
+        </w:rPr>
+        <w:t xml:space="preserve"> 50 epochs</w:t>
+      </w:r>
+      <w:r>
+        <w:rPr>
+          <w:sz w:val="20"/>
+          <w:szCs w:val="28"/>
+          <w14:ligatures w14:val="standard"/>
+        </w:rPr>
+        <w:t>.</w:t>
       </w:r>
       <w:r>
         <w:rPr>
@@ -671,15 +703,15 @@
           <w:szCs w:val="28"/>
           <w14:ligatures w14:val="standard"/>
         </w:rPr>
-        <w:t xml:space="preserve">. The update only running </w:t>
-      </w:r>
-      <w:r>
-        <w:rPr>
-          <w:sz w:val="20"/>
-          <w:szCs w:val="28"/>
-          <w14:ligatures w14:val="standard"/>
-        </w:rPr>
-        <w:t>them once is to allow for the update process to be fast instead of having to wait on multiple epochs.</w:t>
+        <w:t xml:space="preserve">. The update only running them once is to </w:t>
+      </w:r>
+      <w:r>
+        <w:rPr>
+          <w:sz w:val="20"/>
+          <w:szCs w:val="28"/>
+          <w14:ligatures w14:val="standard"/>
+        </w:rPr>
+        <w:t>allow for the update process to be fast instead of having to wait on multiple epochs.</w:t>
       </w:r>
       <w:r>
         <w:rPr>
@@ -688,6 +720,22 @@
           <w14:ligatures w14:val="standard"/>
         </w:rPr>
         <w:t xml:space="preserve"> Prediction is just running the input through the feed forward network with dropout layers disabled to match keras.</w:t>
+      </w:r>
+      <w:r>
+        <w:rPr>
+          <w:sz w:val="20"/>
+          <w:szCs w:val="28"/>
+          <w14:ligatures w14:val="standard"/>
+        </w:rPr>
+        <w:t xml:space="preserve"> Furthermore, we used SMOTE in </w:t>
+      </w:r>
+      <w:r>
+        <w:rPr>
+          <w:sz w:val="20"/>
+          <w:szCs w:val="28"/>
+          <w14:ligatures w14:val="standard"/>
+        </w:rPr>
+        <w:t>order to account for the imbalance in the data and give more weight to positive points through oversampling.</w:t>
       </w:r>
     </w:p>
     <w:p>
@@ -786,7 +834,23 @@
           <w:szCs w:val="28"/>
           <w14:ligatures w14:val="standard"/>
         </w:rPr>
-        <w:t xml:space="preserve">. Afterwards, the model has 2 api calls that can be used, one </w:t>
+        <w:t>.</w:t>
+      </w:r>
+      <w:r>
+        <w:rPr>
+          <w:sz w:val="20"/>
+          <w:szCs w:val="28"/>
+          <w14:ligatures w14:val="standard"/>
+        </w:rPr>
+        <w:t xml:space="preserve"> If a saved model is found, that is used instead</w:t>
+      </w:r>
+      <w:r>
+        <w:rPr>
+          <w:sz w:val="20"/>
+          <w:szCs w:val="28"/>
+          <w14:ligatures w14:val="standard"/>
+        </w:rPr>
+        <w:t xml:space="preserve"> Afterwards, the model has 2 api calls that can be used, one </w:t>
       </w:r>
       <w:r>
         <w:rPr>
@@ -871,7 +935,7 @@
                     </pic:cNvPicPr>
                   </pic:nvPicPr>
                   <pic:blipFill rotWithShape="1">
-                    <a:blip r:embed="rId9" cstate="print">
+                    <a:blip r:embed="rId11" cstate="print">
                       <a:extLst>
                         <a:ext uri="{28A0092B-C50C-407E-A947-70E740481C1C}">
                           <a14:useLocalDpi xmlns:a14="http://schemas.microsoft.com/office/drawing/2010/main" val="0"/>
@@ -944,7 +1008,7 @@
           <w:sz w:val="20"/>
           <w:szCs w:val="20"/>
         </w:rPr>
-        <w:t xml:space="preserve">The advantage of choosing a neural network is that it was one of the better performing approaches and that its feed forward and backpropagation system helps account for different data instances. Furthermore, the ability to use focal loss helps eliminate the issue of the minority class being </w:t>
+        <w:t xml:space="preserve">The advantage of choosing a neural network is that it was one of the better performing approaches and that its feed </w:t>
       </w:r>
       <w:r>
         <w:rPr>
@@ -952,7 +1016,7 @@
           <w:szCs w:val="20"/>
         </w:rPr>
         <w:lastRenderedPageBreak/>
-        <w:t>ignored. On the other hand, it is more complex to build and train compared to other machine learning approaches.</w:t>
+        <w:t>forward and backpropagation system helps account for different data instances. Furthermore, the ability to use focal loss helps eliminate the issue of the minority class being ignored. On the other hand, it is more complex to build and train compared to other machine learning approaches.</w:t>
       </w:r>
     </w:p>
     <w:p/>
@@ -1015,7 +1079,7 @@
                     </pic:cNvPicPr>
                   </pic:nvPicPr>
                   <pic:blipFill>
-                    <a:blip r:embed="rId10" cstate="print">
+                    <a:blip r:embed="rId12" cstate="print">
                       <a:extLst>
                         <a:ext uri="{28A0092B-C50C-407E-A947-70E740481C1C}">
                           <a14:useLocalDpi xmlns:a14="http://schemas.microsoft.com/office/drawing/2010/main" val="0"/>
@@ -1254,14 +1318,14 @@
           <w:sz w:val="20"/>
           <w:szCs w:val="20"/>
         </w:rPr>
-        <w:t xml:space="preserve">just in case it got corrupted or tampered with during transfer. If the data is faulty, a return API call is sent to indicate an issue. The data is then used by the model to predict whether the user has diabetes based on the data sent. The prediction is sent as another JSON object to the user through an API call and the user </w:t>
-      </w:r>
-      <w:r>
-        <w:rPr>
-          <w:sz w:val="20"/>
-          <w:szCs w:val="20"/>
-        </w:rPr>
-        <w:t>receives their prediction.</w:t>
+        <w:t xml:space="preserve">just in case it got corrupted or tampered with during transfer. If the data is faulty, a return API call is sent to indicate an issue. The data is then used by </w:t>
+      </w:r>
+      <w:r>
+        <w:rPr>
+          <w:sz w:val="20"/>
+          <w:szCs w:val="20"/>
+        </w:rPr>
+        <w:t>the model to predict whether the user has diabetes based on the data sent. The prediction is sent as another JSON object to the user through an API call and the user receives their prediction.</w:t>
       </w:r>
       <w:r>
         <w:rPr>
@@ -1287,6 +1351,31 @@
     </w:sectPr>
   </w:body>
 </w:document>
+</file>
+
+<file path=word/endnotes.xml><?xml version="1.0" encoding="utf-8"?>
+<w:endnotes xmlns:wpc="http://schemas.microsoft.com/office/word/2010/wordprocessingCanvas" xmlns:cx="http://schemas.microsoft.com/office/drawing/2014/chartex" xmlns:cx1="http://schemas.microsoft.com/office/drawing/2015/9/8/chartex" xmlns:cx2="http://schemas.microsoft.com/office/drawing/2015/10/21/chartex" xmlns:cx3="http://schemas.microsoft.com/office/drawing/2016/5/9/chartex" xmlns:cx4="http://schemas.microsoft.com/office/drawing/2016/5/10/chartex" xmlns:cx5="http://schemas.microsoft.com/office/drawing/2016/5/11/chartex" xmlns:cx6="http://schemas.microsoft.com/office/drawing/2016/5/12/chartex" xmlns:cx7="http://schemas.microsoft.com/office/drawing/2016/5/13/chartex" xmlns:cx8="http://schemas.microsoft.com/office/drawing/2016/5/14/chartex" xmlns:mc="http://schemas.openxmlformats.org/markup-compatibility/2006" xmlns:aink="http://schemas.microsoft.com/office/drawing/2016/ink" xmlns:am3d="http://schemas.microsoft.com/office/drawing/2017/model3d" xmlns:o="urn:schemas-microsoft-com:office:office" xmlns:oel="http://schemas.microsoft.com/office/2019/extlst" xmlns:r="http://schemas.openxmlformats.org/officeDocument/2006/relationships" xmlns:m="http://schemas.openxmlformats.org/officeDocument/2006/math" xmlns:v="urn:schemas-microsoft-com:vml" xmlns:wp14="http://schemas.microsoft.com/office/word/2010/wordprocessingDrawing" xmlns:wp="http://schemas.openxmlformats.org/drawingml/2006/wordprocessingDrawing" xmlns:w10="urn:schemas-microsoft-com:office:word" xmlns:w="http://schemas.openxmlformats.org/wordprocessingml/2006/main" xmlns:w14="http://schemas.microsoft.com/office/word/2010/wordml" xmlns:w15="http://schemas.microsoft.com/office/word/2012/wordml" xmlns:w16cex="http://schemas.microsoft.com/office/word/2018/wordml/cex" xmlns:w16cid="http://schemas.microsoft.com/office/word/2016/wordml/cid" xmlns:w16="http://schemas.microsoft.com/office/word/2018/wordml" xmlns:w16du="http://schemas.microsoft.com/office/word/2023/wordml/word16du" xmlns:w16sdtdh="http://schemas.microsoft.com/office/word/2020/wordml/sdtdatahash" xmlns:w16sdtfl="http://schemas.microsoft.com/office/word/2024/wordml/sdtformatlock" xmlns:w16se="http://schemas.microsoft.com/office/word/2015/wordml/symex" xmlns:wpg="http://schemas.microsoft.com/office/word/2010/wordprocessingGroup" xmlns:wpi="http://schemas.microsoft.com/office/word/2010/wordprocessingInk" xmlns:wne="http://schemas.microsoft.com/office/word/2006/wordml" xmlns:wps="http://schemas.microsoft.com/office/word/2010/wordprocessingShape" mc:Ignorable="w14 w15 w16se w16cid w16 w16cex w16sdtdh w16sdtfl w16du wp14">
+  <w:endnote w:type="separator" w:id="-1">
+    <w:p>
+      <w:pPr>
+        <w:spacing w:line="240" w:lineRule="auto"/>
+      </w:pPr>
+      <w:r>
+        <w:separator/>
+      </w:r>
+    </w:p>
+  </w:endnote>
+  <w:endnote w:type="continuationSeparator" w:id="0">
+    <w:p>
+      <w:pPr>
+        <w:spacing w:line="240" w:lineRule="auto"/>
+      </w:pPr>
+      <w:r>
+        <w:continuationSeparator/>
+      </w:r>
+    </w:p>
+  </w:endnote>
+</w:endnotes>
 </file>
 
 <file path=word/footer1.xml><?xml version="1.0" encoding="utf-8"?>
@@ -1324,6 +1413,31 @@
     </w:pPr>
   </w:p>
 </w:ftr>
+</file>
+
+<file path=word/footnotes.xml><?xml version="1.0" encoding="utf-8"?>
+<w:footnotes xmlns:wpc="http://schemas.microsoft.com/office/word/2010/wordprocessingCanvas" xmlns:cx="http://schemas.microsoft.com/office/drawing/2014/chartex" xmlns:cx1="http://schemas.microsoft.com/office/drawing/2015/9/8/chartex" xmlns:cx2="http://schemas.microsoft.com/office/drawing/2015/10/21/chartex" xmlns:cx3="http://schemas.microsoft.com/office/drawing/2016/5/9/chartex" xmlns:cx4="http://schemas.microsoft.com/office/drawing/2016/5/10/chartex" xmlns:cx5="http://schemas.microsoft.com/office/drawing/2016/5/11/chartex" xmlns:cx6="http://schemas.microsoft.com/office/drawing/2016/5/12/chartex" xmlns:cx7="http://schemas.microsoft.com/office/drawing/2016/5/13/chartex" xmlns:cx8="http://schemas.microsoft.com/office/drawing/2016/5/14/chartex" xmlns:mc="http://schemas.openxmlformats.org/markup-compatibility/2006" xmlns:aink="http://schemas.microsoft.com/office/drawing/2016/ink" xmlns:am3d="http://schemas.microsoft.com/office/drawing/2017/model3d" xmlns:o="urn:schemas-microsoft-com:office:office" xmlns:oel="http://schemas.microsoft.com/office/2019/extlst" xmlns:r="http://schemas.openxmlformats.org/officeDocument/2006/relationships" xmlns:m="http://schemas.openxmlformats.org/officeDocument/2006/math" xmlns:v="urn:schemas-microsoft-com:vml" xmlns:wp14="http://schemas.microsoft.com/office/word/2010/wordprocessingDrawing" xmlns:wp="http://schemas.openxmlformats.org/drawingml/2006/wordprocessingDrawing" xmlns:w10="urn:schemas-microsoft-com:office:word" xmlns:w="http://schemas.openxmlformats.org/wordprocessingml/2006/main" xmlns:w14="http://schemas.microsoft.com/office/word/2010/wordml" xmlns:w15="http://schemas.microsoft.com/office/word/2012/wordml" xmlns:w16cex="http://schemas.microsoft.com/office/word/2018/wordml/cex" xmlns:w16cid="http://schemas.microsoft.com/office/word/2016/wordml/cid" xmlns:w16="http://schemas.microsoft.com/office/word/2018/wordml" xmlns:w16du="http://schemas.microsoft.com/office/word/2023/wordml/word16du" xmlns:w16sdtdh="http://schemas.microsoft.com/office/word/2020/wordml/sdtdatahash" xmlns:w16sdtfl="http://schemas.microsoft.com/office/word/2024/wordml/sdtformatlock" xmlns:w16se="http://schemas.microsoft.com/office/word/2015/wordml/symex" xmlns:wpg="http://schemas.microsoft.com/office/word/2010/wordprocessingGroup" xmlns:wpi="http://schemas.microsoft.com/office/word/2010/wordprocessingInk" xmlns:wne="http://schemas.microsoft.com/office/word/2006/wordml" xmlns:wps="http://schemas.microsoft.com/office/word/2010/wordprocessingShape" mc:Ignorable="w14 w15 w16se w16cid w16 w16cex w16sdtdh w16sdtfl w16du wp14">
+  <w:footnote w:type="separator" w:id="-1">
+    <w:p>
+      <w:pPr>
+        <w:spacing w:line="240" w:lineRule="auto"/>
+      </w:pPr>
+      <w:r>
+        <w:separator/>
+      </w:r>
+    </w:p>
+  </w:footnote>
+  <w:footnote w:type="continuationSeparator" w:id="0">
+    <w:p>
+      <w:pPr>
+        <w:spacing w:line="240" w:lineRule="auto"/>
+      </w:pPr>
+      <w:r>
+        <w:continuationSeparator/>
+      </w:r>
+    </w:p>
+  </w:footnote>
+</w:footnotes>
 </file>
 
 <file path=word/header1.xml><?xml version="1.0" encoding="utf-8"?>

</xml_diff>